<commit_message>
Proposal: drop quizzes, per-session coverage, about-me section
</commit_message>
<xml_diff>
--- a/IT-Project-Management-30hr-Syllabus.docx
+++ b/IT-Project-Management-30hr-Syllabus.docx
@@ -19,7 +19,7 @@
           <w:color w:val="444444"/>
           <w:sz w:val="22"/>
         </w:rPr>
-        <w:t>20 Sessions x 1.5 Hours  |  Concepts + Case Studies + Regular Quizzes  |  For Management Students</w:t>
+        <w:t>20 Sessions x 1.5 Hours  |  Concepts + Case Studies + Team Project  |  For Management Students</w:t>
       </w:r>
     </w:p>
     <w:p>
@@ -253,36 +253,6 @@
           </w:p>
         </w:tc>
       </w:tr>
-      <w:tr>
-        <w:tc>
-          <w:tcPr>
-            <w:tcW w:type="dxa" w:w="4320"/>
-          </w:tcPr>
-          <w:p>
-            <w:r/>
-            <w:r>
-              <w:rPr>
-                <w:sz w:val="19"/>
-              </w:rPr>
-              <w:t>Quizzes (formative)</w:t>
-            </w:r>
-          </w:p>
-        </w:tc>
-        <w:tc>
-          <w:tcPr>
-            <w:tcW w:type="dxa" w:w="4320"/>
-          </w:tcPr>
-          <w:p>
-            <w:r/>
-            <w:r>
-              <w:rPr>
-                <w:sz w:val="19"/>
-              </w:rPr>
-              <w:t>20 after-class Google Forms quizzes (one per session, quiz mode with auto-grading), done outside class; feed Participation + Class Test readiness</w:t>
-            </w:r>
-          </w:p>
-        </w:tc>
-      </w:tr>
     </w:tbl>
     <w:p>
       <w:pPr>
@@ -432,7 +402,7 @@
         <w:pStyle w:val="ListBullet"/>
       </w:pPr>
       <w:r>
-        <w:t>90-minute rhythm: 25-min concept burst, then 30-min case/exercise, then 20-min team hands-on, then 15-min quiz/debrief.</w:t>
+        <w:t>90-minute rhythm: 25-min concept burst, then 30-min case/exercise, then 20-min team hands-on, then 15-min debrief and wrap.</w:t>
       </w:r>
     </w:p>
     <w:p>
@@ -525,6 +495,11 @@
         <w:t>6. Session Plan - 20 Sessions x 1.5 Hours</w:t>
       </w:r>
     </w:p>
+    <w:p>
+      <w:r>
+        <w:t>Each session below shows what will be covered: topic, key concepts, hands-on team work, and reading/case.</w:t>
+      </w:r>
+    </w:p>
     <w:tbl>
       <w:tblPr>
         <w:tblStyle w:val="LightGrid-Accent1"/>
@@ -580,7 +555,7 @@
                 <w:b/>
                 <w:sz w:val="19"/>
               </w:rPr>
-              <w:t>Concepts and Hands-on</w:t>
+              <w:t>What will be covered</w:t>
             </w:r>
           </w:p>
         </w:tc>
@@ -595,7 +570,7 @@
                 <w:b/>
                 <w:sz w:val="19"/>
               </w:rPr>
-              <w:t>Reading / Case / Quiz</w:t>
+              <w:t>Reading / Case</w:t>
             </w:r>
           </w:p>
         </w:tc>
@@ -639,7 +614,7 @@
               <w:rPr>
                 <w:sz w:val="19"/>
               </w:rPr>
-              <w:t>What is a project vs programme vs portfolio; triple constraint; why ~70% fail; team formation (4-5 members) + project idea pitch</w:t>
+              <w:t>What is a project, programme and portfolio; the triple constraint (scope-cost-time); why large digital projects fail; team formation and project idea pitch</w:t>
             </w:r>
           </w:p>
         </w:tc>
@@ -697,7 +672,7 @@
               <w:rPr>
                 <w:sz w:val="19"/>
               </w:rPr>
-              <w:t>Systems approach; product vs project life cycles; Waterfall deep-dive; teams draft lifecycle for their project</w:t>
+              <w:t>Systems approach; product vs project life cycles; Waterfall in depth; teams draft the life cycle for their own project</w:t>
             </w:r>
           </w:p>
         </w:tc>
@@ -755,7 +730,7 @@
               <w:rPr>
                 <w:sz w:val="19"/>
               </w:rPr>
-              <w:t>Agile/Scrum + Hybrid; methodology-choice debate</w:t>
+              <w:t>Agile, Scrum and Hybrid methods; structured debate on which method fits which context</w:t>
             </w:r>
           </w:p>
         </w:tc>
@@ -769,7 +744,7 @@
               <w:rPr>
                 <w:sz w:val="19"/>
               </w:rPr>
-              <w:t>Schwalbe Ch.2 + C1; pre-read C1</w:t>
+              <w:t>Schwalbe Ch.2 + C1</w:t>
             </w:r>
           </w:p>
         </w:tc>
@@ -813,7 +788,7 @@
               <w:rPr>
                 <w:sz w:val="19"/>
               </w:rPr>
-              <w:t>Initiating-Planning-Executing-M&amp;E-Closing mapped to knowledge areas; RACI + charter draft</w:t>
+              <w:t>The five process groups (Initiating to Closing) mapped to knowledge areas; drafting a project charter and RACI</w:t>
             </w:r>
           </w:p>
         </w:tc>
@@ -871,7 +846,7 @@
               <w:rPr>
                 <w:sz w:val="19"/>
               </w:rPr>
-              <w:t>Tailoring a methodology; Agile-at-scale pitfalls</w:t>
+              <w:t>Tailoring a methodology to project size and risk; what goes wrong when Agile is scaled carelessly</w:t>
             </w:r>
           </w:p>
         </w:tc>
@@ -885,7 +860,7 @@
               <w:rPr>
                 <w:sz w:val="19"/>
               </w:rPr>
-              <w:t>Schwalbe Ch.3 + C2; pre-read C2</w:t>
+              <w:t>Schwalbe Ch.3 + C2</w:t>
             </w:r>
           </w:p>
         </w:tc>
@@ -929,7 +904,7 @@
               <w:rPr>
                 <w:sz w:val="19"/>
               </w:rPr>
-              <w:t>Strategic alignment; NPV/IRR/payback; options thinking under uncertainty; teams score 3 project options</w:t>
+              <w:t>Strategic alignment; NPV, IRR and payback for project selection; thinking in options under uncertainty; teams score three options</w:t>
             </w:r>
           </w:p>
         </w:tc>
@@ -943,7 +918,7 @@
               <w:rPr>
                 <w:sz w:val="19"/>
               </w:rPr>
-              <w:t>Schwalbe Ch.4 + C3; pre-read C3</w:t>
+              <w:t>Schwalbe Ch.4 + C3</w:t>
             </w:r>
           </w:p>
         </w:tc>
@@ -987,7 +962,7 @@
               <w:rPr>
                 <w:sz w:val="19"/>
               </w:rPr>
-              <w:t>Requirements elicitation; defining scope; building the WBS; teams submit WBS v1</w:t>
+              <w:t>Eliciting requirements; defining scope; building the Work Breakdown Structure; teams submit WBS v1</w:t>
             </w:r>
           </w:p>
         </w:tc>
@@ -1045,7 +1020,7 @@
               <w:rPr>
                 <w:sz w:val="19"/>
               </w:rPr>
-              <w:t>Defining activities; sequencing; network diagrams; critical path exercise</w:t>
+              <w:t>Defining and sequencing activities; network diagrams; finding the critical path (hands-on exercise)</w:t>
             </w:r>
           </w:p>
         </w:tc>
@@ -1103,7 +1078,7 @@
               <w:rPr>
                 <w:sz w:val="19"/>
               </w:rPr>
-              <w:t>Gantt + milestones; crashing vs fast-tracking; teams build Gantt for their project</w:t>
+              <w:t>Gantt charts and milestones; crashing vs fast-tracking; teams build the Gantt for their project</w:t>
             </w:r>
           </w:p>
         </w:tc>
@@ -1147,7 +1122,7 @@
               <w:rPr>
                 <w:sz w:val="19"/>
               </w:rPr>
-              <w:t>Cost Management + QUIZ 1</w:t>
+              <w:t>Cost Management</w:t>
             </w:r>
           </w:p>
         </w:tc>
@@ -1161,7 +1136,7 @@
               <w:rPr>
                 <w:sz w:val="19"/>
               </w:rPr>
-              <w:t>Cost estimating (analogous/parametric/bottom-up); budgeting; after class: Quiz S10 (Google Form, outside class)</w:t>
+              <w:t>Analogous, parametric and bottom-up estimating; budgeting and reserves</w:t>
             </w:r>
           </w:p>
         </w:tc>
@@ -1175,7 +1150,7 @@
               <w:rPr>
                 <w:sz w:val="19"/>
               </w:rPr>
-              <w:t>Schwalbe Ch.7; Quiz S10</w:t>
+              <w:t>Schwalbe Ch.7</w:t>
             </w:r>
           </w:p>
         </w:tc>
@@ -1219,7 +1194,7 @@
               <w:rPr>
                 <w:sz w:val="19"/>
               </w:rPr>
-              <w:t>Plan-Manage-Control quality; QA vs QC; test-plan mini-exercise on AI-project scenario</w:t>
+              <w:t>Plan, manage and control quality; QA vs QC; writing a test plan for an AI-project scenario</w:t>
             </w:r>
           </w:p>
         </w:tc>
@@ -1277,7 +1252,7 @@
               <w:rPr>
                 <w:sz w:val="19"/>
               </w:rPr>
-              <w:t>COBIT, ITIL overview; GDPR/HIPAA essentials; pharma-composite C4 part 1</w:t>
+              <w:t>COBIT and ITIL overview; GDPR and HIPAA essentials; regulated-industry case discussion</w:t>
             </w:r>
           </w:p>
         </w:tc>
@@ -1291,7 +1266,7 @@
               <w:rPr>
                 <w:sz w:val="19"/>
               </w:rPr>
-              <w:t>Trainer-outline block</w:t>
+              <w:t>Trainer-outline block + C4</w:t>
             </w:r>
           </w:p>
         </w:tc>
@@ -1335,7 +1310,7 @@
               <w:rPr>
                 <w:sz w:val="19"/>
               </w:rPr>
-              <w:t>Threats and vulnerabilities; security policies; incident response and recovery tabletop</w:t>
+              <w:t>Common threats and vulnerabilities; security policies; incident response and recovery tabletop</w:t>
             </w:r>
           </w:p>
         </w:tc>
@@ -1393,7 +1368,7 @@
               <w:rPr>
                 <w:sz w:val="19"/>
               </w:rPr>
-              <w:t>Computer-vision + AI project walkthrough (C5); scope-schedule-cost-quality trade-off; after class: Quiz S14 (Google Form)</w:t>
+              <w:t>Walkthrough of computer-vision and AI projects; the scope-schedule-cost-quality trade-off in practice</w:t>
             </w:r>
           </w:p>
         </w:tc>
@@ -1407,7 +1382,7 @@
               <w:rPr>
                 <w:sz w:val="19"/>
               </w:rPr>
-              <w:t>All Ch.1-8; Quiz S14</w:t>
+              <w:t>All Ch.1-8 + C5</w:t>
             </w:r>
           </w:p>
         </w:tc>
@@ -1451,7 +1426,7 @@
               <w:rPr>
                 <w:sz w:val="19"/>
               </w:rPr>
-              <w:t>Resource planning; team charters; motivation and conflict; RACI + estimates for team project</w:t>
+              <w:t>Resource planning and estimation; team charters; motivation, conflict and leading people</w:t>
             </w:r>
           </w:p>
         </w:tc>
@@ -1509,7 +1484,7 @@
               <w:rPr>
                 <w:sz w:val="19"/>
               </w:rPr>
-              <w:t>Comms planning; stakeholder matrix; IT leadership skills; L and D; teams draft comms plan</w:t>
+              <w:t>Communication planning; stakeholder matrix; leadership skills for IT managers; teams draft their comms plan</w:t>
             </w:r>
           </w:p>
         </w:tc>
@@ -1567,7 +1542,7 @@
               <w:rPr>
                 <w:sz w:val="19"/>
               </w:rPr>
-              <w:t>ITSM frameworks and SLAs; why IT projects fail; change-management approach and success factors</w:t>
+              <w:t>IT service management and SLAs; why IT projects fail; the change-management approach and success factors</w:t>
             </w:r>
           </w:p>
         </w:tc>
@@ -1581,7 +1556,7 @@
               <w:rPr>
                 <w:sz w:val="19"/>
               </w:rPr>
-              <w:t>Trainer block + C4 part 2</w:t>
+              <w:t>Trainer block + C4</w:t>
             </w:r>
           </w:p>
         </w:tc>
@@ -1625,7 +1600,7 @@
               <w:rPr>
                 <w:sz w:val="19"/>
               </w:rPr>
-              <w:t>Outsourcing strategies; vendor selection; contract basics; ROI/TCO; after class: Quiz S18 (Google Form)</w:t>
+              <w:t>Outsourcing strategies; vendor selection and contracts; budgeting, ROI and TCO analysis</w:t>
             </w:r>
           </w:p>
         </w:tc>
@@ -1639,7 +1614,7 @@
               <w:rPr>
                 <w:sz w:val="19"/>
               </w:rPr>
-              <w:t>Trainer block; Quiz S18</w:t>
+              <w:t>Trainer block</w:t>
             </w:r>
           </w:p>
         </w:tc>
@@ -1669,7 +1644,7 @@
               <w:rPr>
                 <w:sz w:val="19"/>
               </w:rPr>
-              <w:t>Final Project Clinics and Presentations - I</w:t>
+              <w:t>Final Project Presentations - I</w:t>
             </w:r>
           </w:p>
         </w:tc>
@@ -1683,7 +1658,7 @@
               <w:rPr>
                 <w:sz w:val="19"/>
               </w:rPr>
-              <w:t>Half the teams present proposal (problem, WBS, schedule, cost, risk, governance); peer + instructor feedback</w:t>
+              <w:t>First half of teams present their proposal (problem, WBS, schedule, cost, risk, governance); peer and instructor feedback</w:t>
             </w:r>
           </w:p>
         </w:tc>
@@ -1741,7 +1716,7 @@
               <w:rPr>
                 <w:sz w:val="19"/>
               </w:rPr>
-              <w:t>Remaining teams present; course wrap; end-term briefing</w:t>
+              <w:t>Remaining teams present; course wrap-up and end-term briefing</w:t>
             </w:r>
           </w:p>
         </w:tc>
@@ -1928,7 +1903,7 @@
               <w:rPr>
                 <w:sz w:val="19"/>
               </w:rPr>
-              <w:t>Contribution frequency + quality + listening (rubric below); quizzes count here as evidence</w:t>
+              <w:t>Contribution frequency + quality + listening (rubric below)</w:t>
             </w:r>
           </w:p>
         </w:tc>
@@ -2122,46 +2097,6 @@
         </w:tc>
       </w:tr>
     </w:tbl>
-    <w:p>
-      <w:pPr>
-        <w:pStyle w:val="Heading2"/>
-      </w:pPr>
-      <w:r>
-        <w:t>Regular quizzes - after EVERY class on Google Forms (outside class)</w:t>
-      </w:r>
-    </w:p>
-    <w:p>
-      <w:pPr>
-        <w:pStyle w:val="ListBullet"/>
-      </w:pPr>
-      <w:r>
-        <w:t>One Google Forms quiz per session (S01-S20, 20 quizzes), taken outside class right after each session; links in Appendix A.</w:t>
-      </w:r>
-    </w:p>
-    <w:p>
-      <w:pPr>
-        <w:pStyle w:val="ListBullet"/>
-      </w:pPr>
-      <w:r>
-        <w:t>Format per quiz: 4 auto-graded MCQ (2 pts each = 8) + 1 short reflection text (ungraded, feeds participation and team project). Quiz mode ON with answer key + right/wrong feedback.</w:t>
-      </w:r>
-    </w:p>
-    <w:p>
-      <w:pPr>
-        <w:pStyle w:val="ListBullet"/>
-      </w:pPr>
-      <w:r>
-        <w:t>Cadence: release after each session; close before next session; 5-min debrief opens the next class with the most-missed question.</w:t>
-      </w:r>
-    </w:p>
-    <w:p>
-      <w:pPr>
-        <w:pStyle w:val="ListBullet"/>
-      </w:pPr>
-      <w:r>
-        <w:t>Weight: no separate weight - completion + MCQ average feed Participation (10%) and Class Test readiness; instructor may count best-16 of 20 for fairness.</w:t>
-      </w:r>
-    </w:p>
     <w:p>
       <w:pPr>
         <w:pStyle w:val="Heading2"/>
@@ -2761,7 +2696,7 @@
           <w:color w:val="666666"/>
           <w:sz w:val="16"/>
         </w:rPr>
-        <w:t>Sources: IS-623 IT Project Management course file (IMI Bhubaneswar, PGDM 2024-26, Prof. Rahul Kanyal - outcomes, rubrics, Schwalbe text, HBR cases, session skeleton) + IT Project Management Course Outline and Trainer Profile Ver 1.0 (trainer outline: 70% failure framing, governance/cybersecurity/ITSM/change/outsourcing/finance/leadership blocks, reflection + group-project pedagogy). Synthesised into a 20 x 1.5-hr syllabus with after-class quizzes; no paper titles, authors or numbers invented.</w:t>
+        <w:t>Sources: IS-623 IT Project Management course file (IMI Bhubaneswar, PGDM 2024-26, Prof. Rahul Kanyal - outcomes, rubrics, Schwalbe text, HBR cases, session skeleton) + IT Project Management Course Outline and Trainer Profile Ver 1.0 (trainer outline: 70% failure framing, governance/cybersecurity/ITSM/change/outsourcing/finance/leadership blocks, reflection + group-project pedagogy). Synthesised into a 20 x 1.5-hr proposal syllabus; no paper titles, authors or numbers invented.</w:t>
       </w:r>
     </w:p>
     <w:p>
@@ -2769,954 +2704,19 @@
         <w:pStyle w:val="Heading1"/>
       </w:pPr>
       <w:r>
-        <w:t>Appendix A. After-Class Google Forms Quizzes (S01-S20, outside class)</w:t>
+        <w:t>About the Instructor</w:t>
       </w:r>
     </w:p>
     <w:p>
       <w:r>
-        <w:t>All 20 quizzes are live Google Forms in quiz mode (4 auto-graded MCQ x 2 pts + 1 reflection text). Release after each session; 5-min most-missed-question debrief opens the next class.</w:t>
+        <w:t>Subhankar Pattanayak is an AI Strategist at SAP and Founder of TechSambad (techsambad.com), working at the intersection of agentic AI, enterprise architecture and applied AI in education. He teaches simulation-driven, hands-on courses (including MG3003 Enterprise HRIS Architecture at Silicon University), where student teams build deployable artifacts rather than memorise theory. His industry work spans automation, AI-assisted delivery and rapid prototype-driven ("vibe coding") research, which is also his PhD lane - so this course is taught from real delivery experience: why IT projects fail, how methodology choice, governance, vendor and change management decide outcomes, and what management students can apply from day one.</w:t>
       </w:r>
     </w:p>
-    <w:tbl>
-      <w:tblPr>
-        <w:tblStyle w:val="LightGrid-Accent1"/>
-        <w:tblW w:type="auto" w:w="0"/>
-        <w:jc w:val="center"/>
-        <w:tblLook w:firstColumn="1" w:firstRow="1" w:lastColumn="0" w:lastRow="0" w:noHBand="0" w:noVBand="1" w:val="04A0"/>
-      </w:tblPr>
-      <w:tblGrid>
-        <w:gridCol w:w="2880"/>
-        <w:gridCol w:w="2880"/>
-        <w:gridCol w:w="2880"/>
-      </w:tblGrid>
-      <w:tr>
-        <w:tc>
-          <w:tcPr>
-            <w:tcW w:type="dxa" w:w="2880"/>
-          </w:tcPr>
-          <w:p>
-            <w:r/>
-            <w:r>
-              <w:rPr>
-                <w:b/>
-                <w:sz w:val="19"/>
-              </w:rPr>
-              <w:t>No</w:t>
-            </w:r>
-          </w:p>
-        </w:tc>
-        <w:tc>
-          <w:tcPr>
-            <w:tcW w:type="dxa" w:w="2880"/>
-          </w:tcPr>
-          <w:p>
-            <w:r/>
-            <w:r>
-              <w:rPr>
-                <w:b/>
-                <w:sz w:val="19"/>
-              </w:rPr>
-              <w:t>Quiz</w:t>
-            </w:r>
-          </w:p>
-        </w:tc>
-        <w:tc>
-          <w:tcPr>
-            <w:tcW w:type="dxa" w:w="2880"/>
-          </w:tcPr>
-          <w:p>
-            <w:r/>
-            <w:r>
-              <w:rPr>
-                <w:b/>
-                <w:sz w:val="19"/>
-              </w:rPr>
-              <w:t>Responder link (share with students)</w:t>
-            </w:r>
-          </w:p>
-        </w:tc>
-      </w:tr>
-      <w:tr>
-        <w:tc>
-          <w:tcPr>
-            <w:tcW w:type="dxa" w:w="2880"/>
-          </w:tcPr>
-          <w:p>
-            <w:r/>
-            <w:r>
-              <w:rPr>
-                <w:sz w:val="19"/>
-              </w:rPr>
-              <w:t>1</w:t>
-            </w:r>
-          </w:p>
-        </w:tc>
-        <w:tc>
-          <w:tcPr>
-            <w:tcW w:type="dxa" w:w="2880"/>
-          </w:tcPr>
-          <w:p>
-            <w:r/>
-            <w:r>
-              <w:rPr>
-                <w:sz w:val="19"/>
-              </w:rPr>
-              <w:t>ITPM Quiz S01 - What Is an IT Project?</w:t>
-            </w:r>
-          </w:p>
-        </w:tc>
-        <w:tc>
-          <w:tcPr>
-            <w:tcW w:type="dxa" w:w="2880"/>
-          </w:tcPr>
-          <w:p>
-            <w:r/>
-            <w:r>
-              <w:rPr>
-                <w:sz w:val="19"/>
-              </w:rPr>
-              <w:t>https://docs.google.com/forms/d/1nek9hTf5glHIEiF4lG8l_kb_FV6N7uGYc09UDFqTGBA/viewform</w:t>
-            </w:r>
-          </w:p>
-        </w:tc>
-      </w:tr>
-      <w:tr>
-        <w:tc>
-          <w:tcPr>
-            <w:tcW w:type="dxa" w:w="2880"/>
-          </w:tcPr>
-          <w:p>
-            <w:r/>
-            <w:r>
-              <w:rPr>
-                <w:sz w:val="19"/>
-              </w:rPr>
-              <w:t>2</w:t>
-            </w:r>
-          </w:p>
-        </w:tc>
-        <w:tc>
-          <w:tcPr>
-            <w:tcW w:type="dxa" w:w="2880"/>
-          </w:tcPr>
-          <w:p>
-            <w:r/>
-            <w:r>
-              <w:rPr>
-                <w:sz w:val="19"/>
-              </w:rPr>
-              <w:t>ITPM Quiz S02 - Project Life Cycles and Waterfall</w:t>
-            </w:r>
-          </w:p>
-        </w:tc>
-        <w:tc>
-          <w:tcPr>
-            <w:tcW w:type="dxa" w:w="2880"/>
-          </w:tcPr>
-          <w:p>
-            <w:r/>
-            <w:r>
-              <w:rPr>
-                <w:sz w:val="19"/>
-              </w:rPr>
-              <w:t>https://docs.google.com/forms/d/1zWWegVirWRl6jfrqE2FEb3qfuoqe77fel5bVwwsGTOg/viewform</w:t>
-            </w:r>
-          </w:p>
-        </w:tc>
-      </w:tr>
-      <w:tr>
-        <w:tc>
-          <w:tcPr>
-            <w:tcW w:type="dxa" w:w="2880"/>
-          </w:tcPr>
-          <w:p>
-            <w:r/>
-            <w:r>
-              <w:rPr>
-                <w:sz w:val="19"/>
-              </w:rPr>
-              <w:t>3</w:t>
-            </w:r>
-          </w:p>
-        </w:tc>
-        <w:tc>
-          <w:tcPr>
-            <w:tcW w:type="dxa" w:w="2880"/>
-          </w:tcPr>
-          <w:p>
-            <w:r/>
-            <w:r>
-              <w:rPr>
-                <w:sz w:val="19"/>
-              </w:rPr>
-              <w:t>ITPM Quiz S03 - Agile, Scrum and Hybrid (Case C1)</w:t>
-            </w:r>
-          </w:p>
-        </w:tc>
-        <w:tc>
-          <w:tcPr>
-            <w:tcW w:type="dxa" w:w="2880"/>
-          </w:tcPr>
-          <w:p>
-            <w:r/>
-            <w:r>
-              <w:rPr>
-                <w:sz w:val="19"/>
-              </w:rPr>
-              <w:t>https://docs.google.com/forms/d/18QdX7nPx0mVYKreXbNId5x4cz34EDzi9FjeFOaKZmuU/viewform</w:t>
-            </w:r>
-          </w:p>
-        </w:tc>
-      </w:tr>
-      <w:tr>
-        <w:tc>
-          <w:tcPr>
-            <w:tcW w:type="dxa" w:w="2880"/>
-          </w:tcPr>
-          <w:p>
-            <w:r/>
-            <w:r>
-              <w:rPr>
-                <w:sz w:val="19"/>
-              </w:rPr>
-              <w:t>4</w:t>
-            </w:r>
-          </w:p>
-        </w:tc>
-        <w:tc>
-          <w:tcPr>
-            <w:tcW w:type="dxa" w:w="2880"/>
-          </w:tcPr>
-          <w:p>
-            <w:r/>
-            <w:r>
-              <w:rPr>
-                <w:sz w:val="19"/>
-              </w:rPr>
-              <w:t>ITPM Quiz S04 - Process Groups and Knowledge Areas</w:t>
-            </w:r>
-          </w:p>
-        </w:tc>
-        <w:tc>
-          <w:tcPr>
-            <w:tcW w:type="dxa" w:w="2880"/>
-          </w:tcPr>
-          <w:p>
-            <w:r/>
-            <w:r>
-              <w:rPr>
-                <w:sz w:val="19"/>
-              </w:rPr>
-              <w:t>https://docs.google.com/forms/d/1s4CyiEc8rfNDZs3QVY7Z7bSCzsKGkxolwReE4KRKCIA/viewform</w:t>
-            </w:r>
-          </w:p>
-        </w:tc>
-      </w:tr>
-      <w:tr>
-        <w:tc>
-          <w:tcPr>
-            <w:tcW w:type="dxa" w:w="2880"/>
-          </w:tcPr>
-          <w:p>
-            <w:r/>
-            <w:r>
-              <w:rPr>
-                <w:sz w:val="19"/>
-              </w:rPr>
-              <w:t>5</w:t>
-            </w:r>
-          </w:p>
-        </w:tc>
-        <w:tc>
-          <w:tcPr>
-            <w:tcW w:type="dxa" w:w="2880"/>
-          </w:tcPr>
-          <w:p>
-            <w:r/>
-            <w:r>
-              <w:rPr>
-                <w:sz w:val="19"/>
-              </w:rPr>
-              <w:t>ITPM Quiz S05 - Tailoring Methodology; Agile at Scale (Case C2)</w:t>
-            </w:r>
-          </w:p>
-        </w:tc>
-        <w:tc>
-          <w:tcPr>
-            <w:tcW w:type="dxa" w:w="2880"/>
-          </w:tcPr>
-          <w:p>
-            <w:r/>
-            <w:r>
-              <w:rPr>
-                <w:sz w:val="19"/>
-              </w:rPr>
-              <w:t>https://docs.google.com/forms/d/1z8Lmr0BDprUx2d3QxJcVfNNC52t81ZTEiJd6u8JwyDM/viewform</w:t>
-            </w:r>
-          </w:p>
-        </w:tc>
-      </w:tr>
-      <w:tr>
-        <w:tc>
-          <w:tcPr>
-            <w:tcW w:type="dxa" w:w="2880"/>
-          </w:tcPr>
-          <w:p>
-            <w:r/>
-            <w:r>
-              <w:rPr>
-                <w:sz w:val="19"/>
-              </w:rPr>
-              <w:t>6</w:t>
-            </w:r>
-          </w:p>
-        </w:tc>
-        <w:tc>
-          <w:tcPr>
-            <w:tcW w:type="dxa" w:w="2880"/>
-          </w:tcPr>
-          <w:p>
-            <w:r/>
-            <w:r>
-              <w:rPr>
-                <w:sz w:val="19"/>
-              </w:rPr>
-              <w:t>ITPM Quiz S06 - Integration and Project Selection (Case C3)</w:t>
-            </w:r>
-          </w:p>
-        </w:tc>
-        <w:tc>
-          <w:tcPr>
-            <w:tcW w:type="dxa" w:w="2880"/>
-          </w:tcPr>
-          <w:p>
-            <w:r/>
-            <w:r>
-              <w:rPr>
-                <w:sz w:val="19"/>
-              </w:rPr>
-              <w:t>https://docs.google.com/forms/d/1ccX7b9SAMGhhKVAXL-Awjqp0DS_pKWxNXf6G3zAufa4/viewform</w:t>
-            </w:r>
-          </w:p>
-        </w:tc>
-      </w:tr>
-      <w:tr>
-        <w:tc>
-          <w:tcPr>
-            <w:tcW w:type="dxa" w:w="2880"/>
-          </w:tcPr>
-          <w:p>
-            <w:r/>
-            <w:r>
-              <w:rPr>
-                <w:sz w:val="19"/>
-              </w:rPr>
-              <w:t>7</w:t>
-            </w:r>
-          </w:p>
-        </w:tc>
-        <w:tc>
-          <w:tcPr>
-            <w:tcW w:type="dxa" w:w="2880"/>
-          </w:tcPr>
-          <w:p>
-            <w:r/>
-            <w:r>
-              <w:rPr>
-                <w:sz w:val="19"/>
-              </w:rPr>
-              <w:t>ITPM Quiz S07 - Scope Management and WBS</w:t>
-            </w:r>
-          </w:p>
-        </w:tc>
-        <w:tc>
-          <w:tcPr>
-            <w:tcW w:type="dxa" w:w="2880"/>
-          </w:tcPr>
-          <w:p>
-            <w:r/>
-            <w:r>
-              <w:rPr>
-                <w:sz w:val="19"/>
-              </w:rPr>
-              <w:t>https://docs.google.com/forms/d/15YagF6HOtKKWf7lmHX5OAa__3lKRWc5eKlykumY2fYE/viewform</w:t>
-            </w:r>
-          </w:p>
-        </w:tc>
-      </w:tr>
-      <w:tr>
-        <w:tc>
-          <w:tcPr>
-            <w:tcW w:type="dxa" w:w="2880"/>
-          </w:tcPr>
-          <w:p>
-            <w:r/>
-            <w:r>
-              <w:rPr>
-                <w:sz w:val="19"/>
-              </w:rPr>
-              <w:t>8</w:t>
-            </w:r>
-          </w:p>
-        </w:tc>
-        <w:tc>
-          <w:tcPr>
-            <w:tcW w:type="dxa" w:w="2880"/>
-          </w:tcPr>
-          <w:p>
-            <w:r/>
-            <w:r>
-              <w:rPr>
-                <w:sz w:val="19"/>
-              </w:rPr>
-              <w:t>ITPM Quiz S08 - Schedule: Activities and Critical Path</w:t>
-            </w:r>
-          </w:p>
-        </w:tc>
-        <w:tc>
-          <w:tcPr>
-            <w:tcW w:type="dxa" w:w="2880"/>
-          </w:tcPr>
-          <w:p>
-            <w:r/>
-            <w:r>
-              <w:rPr>
-                <w:sz w:val="19"/>
-              </w:rPr>
-              <w:t>https://docs.google.com/forms/d/11fwnRIbKtle5tZ1p5tDX7uZo-4At6KR1rptwp_WpBBw/viewform</w:t>
-            </w:r>
-          </w:p>
-        </w:tc>
-      </w:tr>
-      <w:tr>
-        <w:tc>
-          <w:tcPr>
-            <w:tcW w:type="dxa" w:w="2880"/>
-          </w:tcPr>
-          <w:p>
-            <w:r/>
-            <w:r>
-              <w:rPr>
-                <w:sz w:val="19"/>
-              </w:rPr>
-              <w:t>9</w:t>
-            </w:r>
-          </w:p>
-        </w:tc>
-        <w:tc>
-          <w:tcPr>
-            <w:tcW w:type="dxa" w:w="2880"/>
-          </w:tcPr>
-          <w:p>
-            <w:r/>
-            <w:r>
-              <w:rPr>
-                <w:sz w:val="19"/>
-              </w:rPr>
-              <w:t>ITPM Quiz S09 - Gantt, Crashing, Fast-Tracking</w:t>
-            </w:r>
-          </w:p>
-        </w:tc>
-        <w:tc>
-          <w:tcPr>
-            <w:tcW w:type="dxa" w:w="2880"/>
-          </w:tcPr>
-          <w:p>
-            <w:r/>
-            <w:r>
-              <w:rPr>
-                <w:sz w:val="19"/>
-              </w:rPr>
-              <w:t>https://docs.google.com/forms/d/1bOoAZvISpaxJE2FfgccSlCqh0VGY2wYZtcsyqOC-5ZE/viewform</w:t>
-            </w:r>
-          </w:p>
-        </w:tc>
-      </w:tr>
-      <w:tr>
-        <w:tc>
-          <w:tcPr>
-            <w:tcW w:type="dxa" w:w="2880"/>
-          </w:tcPr>
-          <w:p>
-            <w:r/>
-            <w:r>
-              <w:rPr>
-                <w:sz w:val="19"/>
-              </w:rPr>
-              <w:t>10</w:t>
-            </w:r>
-          </w:p>
-        </w:tc>
-        <w:tc>
-          <w:tcPr>
-            <w:tcW w:type="dxa" w:w="2880"/>
-          </w:tcPr>
-          <w:p>
-            <w:r/>
-            <w:r>
-              <w:rPr>
-                <w:sz w:val="19"/>
-              </w:rPr>
-              <w:t>ITPM Quiz S10 - Cost Management and Budgeting</w:t>
-            </w:r>
-          </w:p>
-        </w:tc>
-        <w:tc>
-          <w:tcPr>
-            <w:tcW w:type="dxa" w:w="2880"/>
-          </w:tcPr>
-          <w:p>
-            <w:r/>
-            <w:r>
-              <w:rPr>
-                <w:sz w:val="19"/>
-              </w:rPr>
-              <w:t>https://docs.google.com/forms/d/134bM9CDmD5Tw3GyLGXIsaVYQBWeGEmJVpyWjFQ01Qgc/viewform</w:t>
-            </w:r>
-          </w:p>
-        </w:tc>
-      </w:tr>
-      <w:tr>
-        <w:tc>
-          <w:tcPr>
-            <w:tcW w:type="dxa" w:w="2880"/>
-          </w:tcPr>
-          <w:p>
-            <w:r/>
-            <w:r>
-              <w:rPr>
-                <w:sz w:val="19"/>
-              </w:rPr>
-              <w:t>11</w:t>
-            </w:r>
-          </w:p>
-        </w:tc>
-        <w:tc>
-          <w:tcPr>
-            <w:tcW w:type="dxa" w:w="2880"/>
-          </w:tcPr>
-          <w:p>
-            <w:r/>
-            <w:r>
-              <w:rPr>
-                <w:sz w:val="19"/>
-              </w:rPr>
-              <w:t>ITPM Quiz S11 - Quality Management</w:t>
-            </w:r>
-          </w:p>
-        </w:tc>
-        <w:tc>
-          <w:tcPr>
-            <w:tcW w:type="dxa" w:w="2880"/>
-          </w:tcPr>
-          <w:p>
-            <w:r/>
-            <w:r>
-              <w:rPr>
-                <w:sz w:val="19"/>
-              </w:rPr>
-              <w:t>https://docs.google.com/forms/d/1Xa3bZLujcqoaK0iK2jBKjd66HWbCsP2Ce4EV_FHg_N4/viewform</w:t>
-            </w:r>
-          </w:p>
-        </w:tc>
-      </w:tr>
-      <w:tr>
-        <w:tc>
-          <w:tcPr>
-            <w:tcW w:type="dxa" w:w="2880"/>
-          </w:tcPr>
-          <w:p>
-            <w:r/>
-            <w:r>
-              <w:rPr>
-                <w:sz w:val="19"/>
-              </w:rPr>
-              <w:t>12</w:t>
-            </w:r>
-          </w:p>
-        </w:tc>
-        <w:tc>
-          <w:tcPr>
-            <w:tcW w:type="dxa" w:w="2880"/>
-          </w:tcPr>
-          <w:p>
-            <w:r/>
-            <w:r>
-              <w:rPr>
-                <w:sz w:val="19"/>
-              </w:rPr>
-              <w:t>ITPM Quiz S12 - IT Governance and Compliance</w:t>
-            </w:r>
-          </w:p>
-        </w:tc>
-        <w:tc>
-          <w:tcPr>
-            <w:tcW w:type="dxa" w:w="2880"/>
-          </w:tcPr>
-          <w:p>
-            <w:r/>
-            <w:r>
-              <w:rPr>
-                <w:sz w:val="19"/>
-              </w:rPr>
-              <w:t>https://docs.google.com/forms/d/1tDvotFWBCsEokS-L0PFjF8Li4_fg-0Ao_o0R0MBUYI0/viewform</w:t>
-            </w:r>
-          </w:p>
-        </w:tc>
-      </w:tr>
-      <w:tr>
-        <w:tc>
-          <w:tcPr>
-            <w:tcW w:type="dxa" w:w="2880"/>
-          </w:tcPr>
-          <w:p>
-            <w:r/>
-            <w:r>
-              <w:rPr>
-                <w:sz w:val="19"/>
-              </w:rPr>
-              <w:t>13</w:t>
-            </w:r>
-          </w:p>
-        </w:tc>
-        <w:tc>
-          <w:tcPr>
-            <w:tcW w:type="dxa" w:w="2880"/>
-          </w:tcPr>
-          <w:p>
-            <w:r/>
-            <w:r>
-              <w:rPr>
-                <w:sz w:val="19"/>
-              </w:rPr>
-              <w:t>ITPM Quiz S13 - Cybersecurity Management</w:t>
-            </w:r>
-          </w:p>
-        </w:tc>
-        <w:tc>
-          <w:tcPr>
-            <w:tcW w:type="dxa" w:w="2880"/>
-          </w:tcPr>
-          <w:p>
-            <w:r/>
-            <w:r>
-              <w:rPr>
-                <w:sz w:val="19"/>
-              </w:rPr>
-              <w:t>https://docs.google.com/forms/d/1SfJDDCGhij_ZQYD50raYVca1wbpQymtMTw6gLOBGttE/viewform</w:t>
-            </w:r>
-          </w:p>
-        </w:tc>
-      </w:tr>
-      <w:tr>
-        <w:tc>
-          <w:tcPr>
-            <w:tcW w:type="dxa" w:w="2880"/>
-          </w:tcPr>
-          <w:p>
-            <w:r/>
-            <w:r>
-              <w:rPr>
-                <w:sz w:val="19"/>
-              </w:rPr>
-              <w:t>14</w:t>
-            </w:r>
-          </w:p>
-        </w:tc>
-        <w:tc>
-          <w:tcPr>
-            <w:tcW w:type="dxa" w:w="2880"/>
-          </w:tcPr>
-          <w:p>
-            <w:r/>
-            <w:r>
-              <w:rPr>
-                <w:sz w:val="19"/>
-              </w:rPr>
-              <w:t>ITPM Quiz S14 - AI / Computer-Vision Projects in Practice</w:t>
-            </w:r>
-          </w:p>
-        </w:tc>
-        <w:tc>
-          <w:tcPr>
-            <w:tcW w:type="dxa" w:w="2880"/>
-          </w:tcPr>
-          <w:p>
-            <w:r/>
-            <w:r>
-              <w:rPr>
-                <w:sz w:val="19"/>
-              </w:rPr>
-              <w:t>https://docs.google.com/forms/d/16-9KWWMH4CACY-Gp3toCqpByHUeQew9cHiVGa0DRLpo/viewform</w:t>
-            </w:r>
-          </w:p>
-        </w:tc>
-      </w:tr>
-      <w:tr>
-        <w:tc>
-          <w:tcPr>
-            <w:tcW w:type="dxa" w:w="2880"/>
-          </w:tcPr>
-          <w:p>
-            <w:r/>
-            <w:r>
-              <w:rPr>
-                <w:sz w:val="19"/>
-              </w:rPr>
-              <w:t>15</w:t>
-            </w:r>
-          </w:p>
-        </w:tc>
-        <w:tc>
-          <w:tcPr>
-            <w:tcW w:type="dxa" w:w="2880"/>
-          </w:tcPr>
-          <w:p>
-            <w:r/>
-            <w:r>
-              <w:rPr>
-                <w:sz w:val="19"/>
-              </w:rPr>
-              <w:t>ITPM Quiz S15 - Resource Management</w:t>
-            </w:r>
-          </w:p>
-        </w:tc>
-        <w:tc>
-          <w:tcPr>
-            <w:tcW w:type="dxa" w:w="2880"/>
-          </w:tcPr>
-          <w:p>
-            <w:r/>
-            <w:r>
-              <w:rPr>
-                <w:sz w:val="19"/>
-              </w:rPr>
-              <w:t>https://docs.google.com/forms/d/1bh6S68TGRb5wWhbFGEXf65pdb1qKNpAc1xJJ3F7YJzo/viewform</w:t>
-            </w:r>
-          </w:p>
-        </w:tc>
-      </w:tr>
-      <w:tr>
-        <w:tc>
-          <w:tcPr>
-            <w:tcW w:type="dxa" w:w="2880"/>
-          </w:tcPr>
-          <w:p>
-            <w:r/>
-            <w:r>
-              <w:rPr>
-                <w:sz w:val="19"/>
-              </w:rPr>
-              <w:t>16</w:t>
-            </w:r>
-          </w:p>
-        </w:tc>
-        <w:tc>
-          <w:tcPr>
-            <w:tcW w:type="dxa" w:w="2880"/>
-          </w:tcPr>
-          <w:p>
-            <w:r/>
-            <w:r>
-              <w:rPr>
-                <w:sz w:val="19"/>
-              </w:rPr>
-              <w:t>ITPM Quiz S16 - Communications and Leadership</w:t>
-            </w:r>
-          </w:p>
-        </w:tc>
-        <w:tc>
-          <w:tcPr>
-            <w:tcW w:type="dxa" w:w="2880"/>
-          </w:tcPr>
-          <w:p>
-            <w:r/>
-            <w:r>
-              <w:rPr>
-                <w:sz w:val="19"/>
-              </w:rPr>
-              <w:t>https://docs.google.com/forms/d/1rMbOtBQNgmGPG_EEYAAwBJ-S_rNVC1t9ZyOXQqMSr80/viewform</w:t>
-            </w:r>
-          </w:p>
-        </w:tc>
-      </w:tr>
-      <w:tr>
-        <w:tc>
-          <w:tcPr>
-            <w:tcW w:type="dxa" w:w="2880"/>
-          </w:tcPr>
-          <w:p>
-            <w:r/>
-            <w:r>
-              <w:rPr>
-                <w:sz w:val="19"/>
-              </w:rPr>
-              <w:t>17</w:t>
-            </w:r>
-          </w:p>
-        </w:tc>
-        <w:tc>
-          <w:tcPr>
-            <w:tcW w:type="dxa" w:w="2880"/>
-          </w:tcPr>
-          <w:p>
-            <w:r/>
-            <w:r>
-              <w:rPr>
-                <w:sz w:val="19"/>
-              </w:rPr>
-              <w:t>ITPM Quiz S17 - ITSM, SLAs, Change and Failure</w:t>
-            </w:r>
-          </w:p>
-        </w:tc>
-        <w:tc>
-          <w:tcPr>
-            <w:tcW w:type="dxa" w:w="2880"/>
-          </w:tcPr>
-          <w:p>
-            <w:r/>
-            <w:r>
-              <w:rPr>
-                <w:sz w:val="19"/>
-              </w:rPr>
-              <w:t>https://docs.google.com/forms/d/19ZLZPLBa8QiiKS3s2KgwwOSTGRhFIxDr_VdzC8QQYqE/viewform</w:t>
-            </w:r>
-          </w:p>
-        </w:tc>
-      </w:tr>
-      <w:tr>
-        <w:tc>
-          <w:tcPr>
-            <w:tcW w:type="dxa" w:w="2880"/>
-          </w:tcPr>
-          <w:p>
-            <w:r/>
-            <w:r>
-              <w:rPr>
-                <w:sz w:val="19"/>
-              </w:rPr>
-              <w:t>18</w:t>
-            </w:r>
-          </w:p>
-        </w:tc>
-        <w:tc>
-          <w:tcPr>
-            <w:tcW w:type="dxa" w:w="2880"/>
-          </w:tcPr>
-          <w:p>
-            <w:r/>
-            <w:r>
-              <w:rPr>
-                <w:sz w:val="19"/>
-              </w:rPr>
-              <w:t>ITPM Quiz S18 - Outsourcing, Vendors and IT Finance</w:t>
-            </w:r>
-          </w:p>
-        </w:tc>
-        <w:tc>
-          <w:tcPr>
-            <w:tcW w:type="dxa" w:w="2880"/>
-          </w:tcPr>
-          <w:p>
-            <w:r/>
-            <w:r>
-              <w:rPr>
-                <w:sz w:val="19"/>
-              </w:rPr>
-              <w:t>https://docs.google.com/forms/d/1h9r9OOcaeXNilpBbK15jXKuRkMNfd3_O2Gr5ssc6tac/viewform</w:t>
-            </w:r>
-          </w:p>
-        </w:tc>
-      </w:tr>
-      <w:tr>
-        <w:tc>
-          <w:tcPr>
-            <w:tcW w:type="dxa" w:w="2880"/>
-          </w:tcPr>
-          <w:p>
-            <w:r/>
-            <w:r>
-              <w:rPr>
-                <w:sz w:val="19"/>
-              </w:rPr>
-              <w:t>19</w:t>
-            </w:r>
-          </w:p>
-        </w:tc>
-        <w:tc>
-          <w:tcPr>
-            <w:tcW w:type="dxa" w:w="2880"/>
-          </w:tcPr>
-          <w:p>
-            <w:r/>
-            <w:r>
-              <w:rPr>
-                <w:sz w:val="19"/>
-              </w:rPr>
-              <w:t>ITPM Quiz S19 - Presentations I: Peer Review Lens</w:t>
-            </w:r>
-          </w:p>
-        </w:tc>
-        <w:tc>
-          <w:tcPr>
-            <w:tcW w:type="dxa" w:w="2880"/>
-          </w:tcPr>
-          <w:p>
-            <w:r/>
-            <w:r>
-              <w:rPr>
-                <w:sz w:val="19"/>
-              </w:rPr>
-              <w:t>https://docs.google.com/forms/d/1-A_1FevNdo0D-Cupovdzso06JnJY635OeuuECysk0m0/viewform</w:t>
-            </w:r>
-          </w:p>
-        </w:tc>
-      </w:tr>
-      <w:tr>
-        <w:tc>
-          <w:tcPr>
-            <w:tcW w:type="dxa" w:w="2880"/>
-          </w:tcPr>
-          <w:p>
-            <w:r/>
-            <w:r>
-              <w:rPr>
-                <w:sz w:val="19"/>
-              </w:rPr>
-              <w:t>20</w:t>
-            </w:r>
-          </w:p>
-        </w:tc>
-        <w:tc>
-          <w:tcPr>
-            <w:tcW w:type="dxa" w:w="2880"/>
-          </w:tcPr>
-          <w:p>
-            <w:r/>
-            <w:r>
-              <w:rPr>
-                <w:sz w:val="19"/>
-              </w:rPr>
-              <w:t>ITPM Quiz S20 - Course Wrap: From Classroom to Real IT Projects</w:t>
-            </w:r>
-          </w:p>
-        </w:tc>
-        <w:tc>
-          <w:tcPr>
-            <w:tcW w:type="dxa" w:w="2880"/>
-          </w:tcPr>
-          <w:p>
-            <w:r/>
-            <w:r>
-              <w:rPr>
-                <w:sz w:val="19"/>
-              </w:rPr>
-              <w:t>https://docs.google.com/forms/d/1sC1mCqh7zr_ZAvov0nKAgZo2zSnyz0lI-l9BrLlJbhQ/viewform</w:t>
-            </w:r>
-          </w:p>
-        </w:tc>
-      </w:tr>
-    </w:tbl>
+    <w:p>
+      <w:r>
+        <w:t>Contact: subu@techsambad.com | techsambad.com</w:t>
+      </w:r>
+    </w:p>
     <w:sectPr>
       <w:pgSz w:w="12240" w:h="15840"/>
       <w:pgMar w:top="1440" w:right="1800" w:bottom="1440" w:left="1800" w:header="720" w:footer="720" w:gutter="0"/>

</xml_diff>

<commit_message>
Add Agentic AI TA section + LinkedIn/Substack links
</commit_message>
<xml_diff>
--- a/IT-Project-Management-30hr-Syllabus.docx
+++ b/IT-Project-Management-30hr-Syllabus.docx
@@ -427,6 +427,14 @@
       </w:pPr>
       <w:r>
         <w:t>Hands-on team project runs across all 20 sessions - each session adds one artifact to the final proposal.</w:t>
+      </w:r>
+    </w:p>
+    <w:p>
+      <w:pPr>
+        <w:pStyle w:val="ListBullet"/>
+      </w:pPr>
+      <w:r>
+        <w:t>An Agentic AI Teaching Assistant supports every session (see dedicated section below): doubt-clearing, draft feedback and case prep between classes.</w:t>
       </w:r>
     </w:p>
     <w:p>
@@ -2714,7 +2722,57 @@
     </w:p>
     <w:p>
       <w:r>
-        <w:t>Contact: subu@techsambad.com | techsambad.com</w:t>
+        <w:t>LinkedIn: https://in.linkedin.com/in/subhankarp  |  Substack: https://techsambad.substack.com  |  Email: subu@techsambad.com  |  Web: techsambad.com</w:t>
+      </w:r>
+    </w:p>
+    <w:p>
+      <w:pPr>
+        <w:pStyle w:val="Heading1"/>
+      </w:pPr>
+      <w:r>
+        <w:t>Agentic AI as Teaching Assistant</w:t>
+      </w:r>
+    </w:p>
+    <w:p>
+      <w:r>
+        <w:t>An Agentic AI Teaching Assistant supports this course alongside the instructor - not as a replacement for teaching, but as a always-available helper for learning. It is grounded on the course material (Schwalbe chapters, session readings, case briefs and the team-project milestones) and its job is to keep students unblocked between classes:</w:t>
+      </w:r>
+    </w:p>
+    <w:p>
+      <w:pPr>
+        <w:pStyle w:val="ListBullet"/>
+      </w:pPr>
+      <w:r>
+        <w:t>Doubt-clearing after every session: students can ask concept questions (e.g. critical path, NPV vs options thinking, RACI, SLA drafting) and get guided explanations with pointers back to the session reading - not shortcut answers.</w:t>
+      </w:r>
+    </w:p>
+    <w:p>
+      <w:pPr>
+        <w:pStyle w:val="ListBullet"/>
+      </w:pPr>
+      <w:r>
+        <w:t>Team-project coach: feedback on drafts at each milestone (charter, WBS, Gantt, cost sheet, comms plan, risk register, SLA sketch), suggesting what is missing or inconsistent before instructor review.</w:t>
+      </w:r>
+    </w:p>
+    <w:p>
+      <w:pPr>
+        <w:pStyle w:val="ListBullet"/>
+      </w:pPr>
+      <w:r>
+        <w:t>Case prep partner: helps teams prepare their side of the methodology debate and discussion questions for C1-C3, and walks through the C4-C5 composites.</w:t>
+      </w:r>
+    </w:p>
+    <w:p>
+      <w:pPr>
+        <w:pStyle w:val="ListBullet"/>
+      </w:pPr>
+      <w:r>
+        <w:t>Assessment literacy: explains rubrics and what "exceeds expectation" looks like for participation, project, class test and end-term - without writing student work for them.</w:t>
+      </w:r>
+    </w:p>
+    <w:p>
+      <w:r>
+        <w:t>Ground rules: the AI TA never grades, never writes final submissions for students, and flags when a question needs the instructor. All project judgment calls and final evaluation stay with the instructor. Academic integrity rules (max 20% referenced content; no unauthorised aid in tests) apply to AI-assisted work as well - the TA coaches the process, students own the output.</w:t>
       </w:r>
     </w:p>
     <w:sectPr>

</xml_diff>